<commit_message>
Add a periodic performance appraisal proposal
Twelfth proposal: a documented-conversation appraisal — an editable
template, manager and employee opinions each recorded without sight of
the other before both are revealed, an internal HR note, and a short
overall rating. Runs on paper since employees have no logins: the system
prints the form, HR enters both sides and files the signed scan.

It pulls the employee's disciplinary record for the period into the
appraisal automatically, and feeds the promotion-eligibility rule in
proposal 10. Carries an explicit caveat that a perfunctory annual
appraisal is worse than none.

Index, phasing and the Word build updated to match.

Co-Authored-By: Claude Opus 5 <noreply@anthropic.com>
Claude-Session: https://claude.ai/code/session_016SbA1CZRBKTydZEPGqHqz2
</commit_message>
<xml_diff>
--- a/docs/proposals/مقترحات-تطوير-نظام-الموارد-البشرية.docx
+++ b/docs/proposals/مقترحات-تطوير-نظام-الموارد-البشرية.docx
@@ -76,7 +76,7 @@
           <w:szCs w:val="24"/>
           <w:rtl/>
         </w:rPr>
-        <w:t xml:space="preserve">١١ مقترحاً للمرحلة القادمة</w:t>
+        <w:t xml:space="preserve">١٢ مقترحاً للمرحلة القادمة</w:t>
       </w:r>
     </w:p>
     <w:p>
@@ -1718,6 +1718,108 @@
           </w:p>
         </w:tc>
       </w:tr>
+      <w:tr>
+        <w:tc>
+          <w:tcPr>
+            <w:tcW w:type="dxa" w:w="600"/>
+            <w:tcMar>
+              <w:top w:type="dxa" w:w="80"/>
+              <w:left w:type="dxa" w:w="120"/>
+              <w:bottom w:type="dxa" w:w="80"/>
+              <w:right w:type="dxa" w:w="120"/>
+            </w:tcMar>
+          </w:tcPr>
+          <w:p>
+            <w:pPr>
+              <w:bidi/>
+              <w:spacing w:after="0"/>
+              <w:jc w:val="right"/>
+            </w:pPr>
+            <w:r>
+              <w:rPr>
+                <w:rFonts w:ascii="Arial" w:cs="Arial" w:eastAsia="Arial" w:hAnsi="Arial"/>
+                <w:rtl/>
+              </w:rPr>
+              <w:t xml:space="preserve">12</w:t>
+            </w:r>
+          </w:p>
+        </w:tc>
+        <w:tc>
+          <w:tcPr>
+            <w:tcW w:type="dxa" w:w="2300"/>
+            <w:tcMar>
+              <w:top w:type="dxa" w:w="80"/>
+              <w:left w:type="dxa" w:w="120"/>
+              <w:bottom w:type="dxa" w:w="80"/>
+              <w:right w:type="dxa" w:w="120"/>
+            </w:tcMar>
+          </w:tcPr>
+          <w:p>
+            <w:pPr>
+              <w:bidi/>
+              <w:spacing w:after="0"/>
+              <w:jc w:val="right"/>
+            </w:pPr>
+            <w:r>
+              <w:rPr>
+                <w:rFonts w:ascii="Arial" w:cs="Arial" w:eastAsia="Arial" w:hAnsi="Arial"/>
+                <w:rtl/>
+              </w:rPr>
+              <w:t xml:space="preserve">تقييم الأداء الدوري</w:t>
+            </w:r>
+          </w:p>
+        </w:tc>
+        <w:tc>
+          <w:tcPr>
+            <w:tcW w:type="dxa" w:w="4200"/>
+            <w:tcMar>
+              <w:top w:type="dxa" w:w="80"/>
+              <w:left w:type="dxa" w:w="120"/>
+              <w:bottom w:type="dxa" w:w="80"/>
+              <w:right w:type="dxa" w:w="120"/>
+            </w:tcMar>
+          </w:tcPr>
+          <w:p>
+            <w:pPr>
+              <w:bidi/>
+              <w:spacing w:after="0"/>
+              <w:jc w:val="right"/>
+            </w:pPr>
+            <w:r>
+              <w:rPr>
+                <w:rFonts w:ascii="Arial" w:cs="Arial" w:eastAsia="Arial" w:hAnsi="Arial"/>
+                <w:rtl/>
+              </w:rPr>
+              <w:t xml:space="preserve">لا تسجيل للأداء الإيجابي؛ الترقية والمكافأة بالانطباع</w:t>
+            </w:r>
+          </w:p>
+        </w:tc>
+        <w:tc>
+          <w:tcPr>
+            <w:tcW w:type="dxa" w:w="1900"/>
+            <w:tcMar>
+              <w:top w:type="dxa" w:w="80"/>
+              <w:left w:type="dxa" w:w="120"/>
+              <w:bottom w:type="dxa" w:w="80"/>
+              <w:right w:type="dxa" w:w="120"/>
+            </w:tcMar>
+          </w:tcPr>
+          <w:p>
+            <w:pPr>
+              <w:bidi/>
+              <w:spacing w:after="0"/>
+              <w:jc w:val="right"/>
+            </w:pPr>
+            <w:r>
+              <w:rPr>
+                <w:rFonts w:ascii="Arial" w:cs="Arial" w:eastAsia="Arial" w:hAnsi="Arial"/>
+                <w:rtl/>
+              </w:rPr>
+              <w:t xml:space="preserve">متوسطة</w:t>
+            </w:r>
+          </w:p>
+        </w:tc>
+      </w:tr>
     </w:tbl>
     <w:p>
       <w:pPr>
@@ -1821,21 +1923,21 @@
           <w:bCs/>
           <w:rtl/>
         </w:rPr>
-        <w:t xml:space="preserve">المرحلة الثالثة — التوسّع (5 + 6 + 9 + 10 + 11)</w:t>
-      </w:r>
-    </w:p>
-    <w:p>
-      <w:pPr>
-        <w:bidi/>
-        <w:spacing w:after="120" w:line="300"/>
-        <w:jc w:val="right"/>
-      </w:pPr>
-      <w:r>
-        <w:rPr>
-          <w:rFonts w:ascii="Arial" w:cs="Arial" w:eastAsia="Arial" w:hAnsi="Arial"/>
-          <w:rtl/>
-        </w:rPr>
-        <w:t xml:space="preserve">حسب أولويات الفريق بعد استقرار المرحلتين الأولى والثانية.</w:t>
+        <w:t xml:space="preserve">المرحلة الثالثة — التوسّع (5 + 6 + 9 + 10 + 11 + 12)</w:t>
+      </w:r>
+    </w:p>
+    <w:p>
+      <w:pPr>
+        <w:bidi/>
+        <w:spacing w:after="120" w:line="300"/>
+        <w:jc w:val="right"/>
+      </w:pPr>
+      <w:r>
+        <w:rPr>
+          <w:rFonts w:ascii="Arial" w:cs="Arial" w:eastAsia="Arial" w:hAnsi="Arial"/>
+          <w:rtl/>
+        </w:rPr>
+        <w:t xml:space="preserve">حسب أولويات الفريق بعد استقرار المرحلتين الأولى والثانية. ويُقترح أن يأتي تقييم الأداء (١٢) بعد سجل الترقيات (١٠) تحديداً، لأن أثره الأكبر هو تغذية قرار الترقية.</w:t>
       </w:r>
     </w:p>
     <w:p>
@@ -7407,6 +7509,771 @@
         <w:t xml:space="preserve">عدم مغادرة أي موظف بعهدة غير مستردة.</w:t>
       </w:r>
     </w:p>
+    <w:p>
+      <w:r>
+        <w:br w:type="page"/>
+      </w:r>
+    </w:p>
+    <w:p>
+      <w:pPr>
+        <w:pStyle w:val="Heading1"/>
+        <w:bidi/>
+        <w:spacing w:after="200" w:before="0"/>
+        <w:jc w:val="right"/>
+      </w:pPr>
+      <w:r>
+        <w:rPr>
+          <w:rFonts w:ascii="Arial" w:cs="Arial" w:eastAsia="Arial" w:hAnsi="Arial"/>
+          <w:rtl/>
+        </w:rPr>
+        <w:t xml:space="preserve">12 — تقييم الأداء الدوري</w:t>
+      </w:r>
+    </w:p>
+    <w:p>
+      <w:pPr>
+        <w:bidi/>
+        <w:spacing w:after="120" w:line="300"/>
+        <w:jc w:val="right"/>
+      </w:pPr>
+      <w:r>
+        <w:rPr>
+          <w:rFonts w:ascii="Arial" w:cs="Arial" w:eastAsia="Arial" w:hAnsi="Arial"/>
+          <w:b/>
+          <w:bCs/>
+          <w:rtl/>
+        </w:rPr>
+        <w:t xml:space="preserve">الأولوية المقترحة:</w:t>
+      </w:r>
+      <w:r>
+        <w:rPr>
+          <w:rFonts w:ascii="Arial" w:cs="Arial" w:eastAsia="Arial" w:hAnsi="Arial"/>
+          <w:rtl/>
+        </w:rPr>
+        <w:t xml:space="preserve"> متوسطة · </w:t>
+      </w:r>
+      <w:r>
+        <w:rPr>
+          <w:rFonts w:ascii="Arial" w:cs="Arial" w:eastAsia="Arial" w:hAnsi="Arial"/>
+          <w:b/>
+          <w:bCs/>
+          <w:rtl/>
+        </w:rPr>
+        <w:t xml:space="preserve">الحجم:</w:t>
+      </w:r>
+      <w:r>
+        <w:rPr>
+          <w:rFonts w:ascii="Arial" w:cs="Arial" w:eastAsia="Arial" w:hAnsi="Arial"/>
+          <w:rtl/>
+        </w:rPr>
+        <w:t xml:space="preserve"> متوسط</w:t>
+      </w:r>
+    </w:p>
+    <w:p>
+      <w:pPr>
+        <w:pStyle w:val="Heading2"/>
+        <w:bidi/>
+        <w:spacing w:after="140" w:before="280"/>
+        <w:jc w:val="right"/>
+      </w:pPr>
+      <w:r>
+        <w:rPr>
+          <w:rFonts w:ascii="Arial" w:cs="Arial" w:eastAsia="Arial" w:hAnsi="Arial"/>
+          <w:rtl/>
+        </w:rPr>
+        <w:t xml:space="preserve">الوضع الحالي</w:t>
+      </w:r>
+    </w:p>
+    <w:p>
+      <w:pPr>
+        <w:bidi/>
+        <w:spacing w:after="120" w:line="300"/>
+        <w:jc w:val="right"/>
+      </w:pPr>
+      <w:r>
+        <w:rPr>
+          <w:rFonts w:ascii="Arial" w:cs="Arial" w:eastAsia="Arial" w:hAnsi="Arial"/>
+          <w:rtl/>
+        </w:rPr>
+        <w:t xml:space="preserve">النظام يسجّل </w:t>
+      </w:r>
+      <w:r>
+        <w:rPr>
+          <w:rFonts w:ascii="Arial" w:cs="Arial" w:eastAsia="Arial" w:hAnsi="Arial"/>
+          <w:b/>
+          <w:bCs/>
+          <w:rtl/>
+        </w:rPr>
+        <w:t xml:space="preserve">النصف السلبي فقط</w:t>
+      </w:r>
+      <w:r>
+        <w:rPr>
+          <w:rFonts w:ascii="Arial" w:cs="Arial" w:eastAsia="Arial" w:hAnsi="Arial"/>
+          <w:rtl/>
+        </w:rPr>
+        <w:t xml:space="preserve"> من أداء الموظف: المخالفات والجزاءات وأيام الخصم. لا يوجد أي تسجيل للأداء الإيجابي، ولا تقييم دوري من أي نوع.</w:t>
+      </w:r>
+    </w:p>
+    <w:p>
+      <w:pPr>
+        <w:bidi/>
+        <w:spacing w:after="120" w:line="300"/>
+        <w:jc w:val="right"/>
+      </w:pPr>
+      <w:r>
+        <w:rPr>
+          <w:rFonts w:ascii="Arial" w:cs="Arial" w:eastAsia="Arial" w:hAnsi="Arial"/>
+          <w:rtl/>
+        </w:rPr>
+        <w:t xml:space="preserve">ويترتب على ذلك أمر لافت: </w:t>
+      </w:r>
+      <w:r>
+        <w:rPr>
+          <w:rFonts w:ascii="Arial" w:cs="Arial" w:eastAsia="Arial" w:hAnsi="Arial"/>
+          <w:b/>
+          <w:bCs/>
+          <w:rtl/>
+        </w:rPr>
+        <w:t xml:space="preserve">الموظف الملتزم لا أثر له في النظام إطلاقاً.</w:t>
+      </w:r>
+      <w:r>
+        <w:rPr>
+          <w:rFonts w:ascii="Arial" w:cs="Arial" w:eastAsia="Arial" w:hAnsi="Arial"/>
+          <w:rtl/>
+        </w:rPr>
+        <w:t xml:space="preserve"> خلوّ سجله من المخالفات هو كل ما يقوله النظام عنه — وهو ليس تقديراً، بل مجرد غياب للسيئ. وحين يأتي قرار ترقية أو مكافأة أو اختيار لمهمة، لا يجد الفريق في النظام ما يستند إليه سوى الانطباع الشخصي.</w:t>
+      </w:r>
+    </w:p>
+    <w:p>
+      <w:pPr>
+        <w:pStyle w:val="Heading2"/>
+        <w:bidi/>
+        <w:spacing w:after="140" w:before="280"/>
+        <w:jc w:val="right"/>
+      </w:pPr>
+      <w:r>
+        <w:rPr>
+          <w:rFonts w:ascii="Arial" w:cs="Arial" w:eastAsia="Arial" w:hAnsi="Arial"/>
+          <w:rtl/>
+        </w:rPr>
+        <w:t xml:space="preserve">المقترح</w:t>
+      </w:r>
+    </w:p>
+    <w:p>
+      <w:pPr>
+        <w:bidi/>
+        <w:spacing w:after="120" w:line="300"/>
+        <w:jc w:val="right"/>
+      </w:pPr>
+      <w:r>
+        <w:rPr>
+          <w:rFonts w:ascii="Arial" w:cs="Arial" w:eastAsia="Arial" w:hAnsi="Arial"/>
+          <w:rtl/>
+        </w:rPr>
+        <w:t xml:space="preserve">تقييم دوري (سنوي أو نصف سنوي) على أسلوب </w:t>
+      </w:r>
+      <w:r>
+        <w:rPr>
+          <w:rFonts w:ascii="Arial" w:cs="Arial" w:eastAsia="Arial" w:hAnsi="Arial"/>
+          <w:b/>
+          <w:bCs/>
+          <w:rtl/>
+        </w:rPr>
+        <w:t xml:space="preserve">"المحادثة الموثّقة"</w:t>
+      </w:r>
+      <w:r>
+        <w:rPr>
+          <w:rFonts w:ascii="Arial" w:cs="Arial" w:eastAsia="Arial" w:hAnsi="Arial"/>
+          <w:rtl/>
+        </w:rPr>
+        <w:t xml:space="preserve"> — لا درجات معقدة ولا أوزان نسبية، بل رأيان مكتوبان ومحفوظان:</w:t>
+      </w:r>
+    </w:p>
+    <w:p>
+      <w:pPr>
+        <w:bidi/>
+        <w:spacing w:after="120" w:line="300"/>
+        <w:jc w:val="right"/>
+      </w:pPr>
+      <w:r>
+        <w:rPr>
+          <w:rFonts w:ascii="Arial" w:cs="Arial" w:eastAsia="Arial" w:hAnsi="Arial"/>
+          <w:b/>
+          <w:bCs/>
+          <w:rtl/>
+        </w:rPr>
+        <w:t xml:space="preserve">أ. النموذج</w:t>
+      </w:r>
+    </w:p>
+    <w:p>
+      <w:pPr>
+        <w:bidi/>
+        <w:spacing w:after="120" w:line="300"/>
+        <w:jc w:val="right"/>
+      </w:pPr>
+      <w:r>
+        <w:rPr>
+          <w:rFonts w:ascii="Arial" w:cs="Arial" w:eastAsia="Arial" w:hAnsi="Arial"/>
+          <w:rtl/>
+        </w:rPr>
+        <w:t xml:space="preserve">قالب تقييم بمحاور تحددها الإدارة (جودة العمل، الالتزام، التعامل مع العملاء، العمل الجماعي… إلخ)، قابل للتحرير من الإعدادات، ولكل وظيفة أو قسم قالبه إن لزم.</w:t>
+      </w:r>
+    </w:p>
+    <w:p>
+      <w:pPr>
+        <w:bidi/>
+        <w:spacing w:after="120" w:line="300"/>
+        <w:jc w:val="right"/>
+      </w:pPr>
+      <w:r>
+        <w:rPr>
+          <w:rFonts w:ascii="Arial" w:cs="Arial" w:eastAsia="Arial" w:hAnsi="Arial"/>
+          <w:b/>
+          <w:bCs/>
+          <w:rtl/>
+        </w:rPr>
+        <w:t xml:space="preserve">ب. الرأيان المنفصلان</w:t>
+      </w:r>
+    </w:p>
+    <w:p>
+      <w:pPr>
+        <w:pStyle w:val="ListParagraph"/>
+        <w:numPr>
+          <w:ilvl w:val="0"/>
+          <w:numId w:val="2"/>
+        </w:numPr>
+        <w:bidi/>
+        <w:spacing w:after="80" w:line="300"/>
+        <w:jc w:val="right"/>
+      </w:pPr>
+      <w:r>
+        <w:rPr>
+          <w:rFonts w:ascii="Arial" w:cs="Arial" w:eastAsia="Arial" w:hAnsi="Arial"/>
+          <w:b/>
+          <w:bCs/>
+          <w:rtl/>
+        </w:rPr>
+        <w:t xml:space="preserve">رأي المدير</w:t>
+      </w:r>
+      <w:r>
+        <w:rPr>
+          <w:rFonts w:ascii="Arial" w:cs="Arial" w:eastAsia="Arial" w:hAnsi="Arial"/>
+          <w:rtl/>
+        </w:rPr>
+        <w:t xml:space="preserve"> عن الموظف</w:t>
+      </w:r>
+    </w:p>
+    <w:p>
+      <w:pPr>
+        <w:pStyle w:val="ListParagraph"/>
+        <w:numPr>
+          <w:ilvl w:val="0"/>
+          <w:numId w:val="2"/>
+        </w:numPr>
+        <w:bidi/>
+        <w:spacing w:after="80" w:line="300"/>
+        <w:jc w:val="right"/>
+      </w:pPr>
+      <w:r>
+        <w:rPr>
+          <w:rFonts w:ascii="Arial" w:cs="Arial" w:eastAsia="Arial" w:hAnsi="Arial"/>
+          <w:b/>
+          <w:bCs/>
+          <w:rtl/>
+        </w:rPr>
+        <w:t xml:space="preserve">رأي الموظف</w:t>
+      </w:r>
+      <w:r>
+        <w:rPr>
+          <w:rFonts w:ascii="Arial" w:cs="Arial" w:eastAsia="Arial" w:hAnsi="Arial"/>
+          <w:rtl/>
+        </w:rPr>
+        <w:t xml:space="preserve"> عن نفسه وعن الفترة</w:t>
+      </w:r>
+    </w:p>
+    <w:p>
+      <w:pPr>
+        <w:pBdr>
+          <w:right w:val="single" w:color="E0A030" w:sz="18" w:space="6"/>
+        </w:pBdr>
+        <w:shd w:fill="FFF4E0" w:color="auto" w:val="clear"/>
+        <w:bidi/>
+        <w:spacing w:after="200" w:before="120" w:line="300"/>
+        <w:ind w:start="300" w:end="300"/>
+        <w:jc w:val="right"/>
+      </w:pPr>
+      <w:r>
+        <w:rPr>
+          <w:rFonts w:ascii="Arial" w:cs="Arial" w:eastAsia="Arial" w:hAnsi="Arial"/>
+          <w:b/>
+          <w:bCs/>
+          <w:rtl/>
+        </w:rPr>
+        <w:t xml:space="preserve">المبدأ الجوهري في هذه الطريقة:</w:t>
+      </w:r>
+      <w:r>
+        <w:rPr>
+          <w:rFonts w:ascii="Arial" w:cs="Arial" w:eastAsia="Arial" w:hAnsi="Arial"/>
+          <w:rtl/>
+        </w:rPr>
+        <w:t xml:space="preserve"> كل طرف يكتب رأيه </w:t>
+      </w:r>
+      <w:r>
+        <w:rPr>
+          <w:rFonts w:ascii="Arial" w:cs="Arial" w:eastAsia="Arial" w:hAnsi="Arial"/>
+          <w:b/>
+          <w:bCs/>
+          <w:rtl/>
+        </w:rPr>
+        <w:t xml:space="preserve">دون أن يرى رأي الطرف الآخر</w:t>
+      </w:r>
+      <w:r>
+        <w:rPr>
+          <w:rFonts w:ascii="Arial" w:cs="Arial" w:eastAsia="Arial" w:hAnsi="Arial"/>
+          <w:rtl/>
+        </w:rPr>
+        <w:t xml:space="preserve">، ثم يُكشف الرأيان معاً وتُعقد المناقشة. هذا يمنع أن يكرر أحدهما كلام الآخر أو يجامله، ويجعل التقييم انعكاساً لرأيين مستقلين فعلاً. هذه النقطة هي ما يميّز هذه الطريقة، وإهمالها يفرّغ التقييم من قيمته.</w:t>
+      </w:r>
+    </w:p>
+    <w:p>
+      <w:pPr>
+        <w:bidi/>
+        <w:spacing w:after="120" w:line="300"/>
+        <w:jc w:val="right"/>
+      </w:pPr>
+      <w:r>
+        <w:rPr>
+          <w:rFonts w:ascii="Arial" w:cs="Arial" w:eastAsia="Arial" w:hAnsi="Arial"/>
+          <w:b/>
+          <w:bCs/>
+          <w:rtl/>
+        </w:rPr>
+        <w:t xml:space="preserve">ج. ملاحظة داخلية</w:t>
+      </w:r>
+    </w:p>
+    <w:p>
+      <w:pPr>
+        <w:bidi/>
+        <w:spacing w:after="120" w:line="300"/>
+        <w:jc w:val="right"/>
+      </w:pPr>
+      <w:r>
+        <w:rPr>
+          <w:rFonts w:ascii="Arial" w:cs="Arial" w:eastAsia="Arial" w:hAnsi="Arial"/>
+          <w:rtl/>
+        </w:rPr>
+        <w:t xml:space="preserve">حقل ملاحظات للموارد البشرية لا يُعرض على الموظف — لتوثيق ما لا يُكتب في النموذج الرسمي.</w:t>
+      </w:r>
+    </w:p>
+    <w:p>
+      <w:pPr>
+        <w:bidi/>
+        <w:spacing w:after="120" w:line="300"/>
+        <w:jc w:val="right"/>
+      </w:pPr>
+      <w:r>
+        <w:rPr>
+          <w:rFonts w:ascii="Arial" w:cs="Arial" w:eastAsia="Arial" w:hAnsi="Arial"/>
+          <w:b/>
+          <w:bCs/>
+          <w:rtl/>
+        </w:rPr>
+        <w:t xml:space="preserve">د. الحالات</w:t>
+      </w:r>
+    </w:p>
+    <w:p>
+      <w:pPr>
+        <w:bidi/>
+        <w:spacing w:after="120" w:line="300"/>
+        <w:jc w:val="right"/>
+      </w:pPr>
+      <w:r>
+        <w:rPr>
+          <w:rFonts w:ascii="Arial" w:cs="Arial" w:eastAsia="Arial" w:hAnsi="Arial"/>
+          <w:rtl/>
+        </w:rPr>
+        <w:t xml:space="preserve">مسودة ← جارٍ ← منتهٍ، مع تاريخ إغلاق وتقدير عام مختصر (ممتاز / جيد جداً / جيد / يحتاج تحسين) يصلح للفرز والتقارير.</w:t>
+      </w:r>
+    </w:p>
+    <w:p>
+      <w:pPr>
+        <w:pStyle w:val="Heading2"/>
+        <w:bidi/>
+        <w:spacing w:after="140" w:before="280"/>
+        <w:jc w:val="right"/>
+      </w:pPr>
+      <w:r>
+        <w:rPr>
+          <w:rFonts w:ascii="Arial" w:cs="Arial" w:eastAsia="Arial" w:hAnsi="Arial"/>
+          <w:rtl/>
+        </w:rPr>
+        <w:t xml:space="preserve">كيف يعمل عملياً — مع أن الموظفين لا يدخلون النظام</w:t>
+      </w:r>
+    </w:p>
+    <w:p>
+      <w:pPr>
+        <w:bidi/>
+        <w:spacing w:after="120" w:line="300"/>
+        <w:jc w:val="right"/>
+      </w:pPr>
+      <w:r>
+        <w:rPr>
+          <w:rFonts w:ascii="Arial" w:cs="Arial" w:eastAsia="Arial" w:hAnsi="Arial"/>
+          <w:rtl/>
+        </w:rPr>
+        <w:t xml:space="preserve">هذه النقطة تحتاج وضوحاً: التقييم في الأنظمة الجاهزة يعتمد على أن الموظف يدخل بنفسه ويكتب تقييمه. وبما أن نظامنا مقصور على فريق الموارد البشرية، فالمسار الواقعي هو نفس مسار خطابات الجزاءات:</w:t>
+      </w:r>
+    </w:p>
+    <w:p>
+      <w:pPr>
+        <w:pStyle w:val="ListParagraph"/>
+        <w:numPr>
+          <w:ilvl w:val="0"/>
+          <w:numId w:val="3"/>
+        </w:numPr>
+        <w:bidi/>
+        <w:spacing w:after="80" w:line="300"/>
+        <w:jc w:val="right"/>
+      </w:pPr>
+      <w:r>
+        <w:rPr>
+          <w:rFonts w:ascii="Arial" w:cs="Arial" w:eastAsia="Arial" w:hAnsi="Arial"/>
+          <w:rtl/>
+        </w:rPr>
+        <w:t xml:space="preserve">الموارد البشرية تفتح تقييماً للموظف → النظام </w:t>
+      </w:r>
+      <w:r>
+        <w:rPr>
+          <w:rFonts w:ascii="Arial" w:cs="Arial" w:eastAsia="Arial" w:hAnsi="Arial"/>
+          <w:b/>
+          <w:bCs/>
+          <w:rtl/>
+        </w:rPr>
+        <w:t xml:space="preserve">يطبع نموذجاً جاهزاً (PDF)</w:t>
+      </w:r>
+      <w:r>
+        <w:rPr>
+          <w:rFonts w:ascii="Arial" w:cs="Arial" w:eastAsia="Arial" w:hAnsi="Arial"/>
+          <w:rtl/>
+        </w:rPr>
+        <w:t xml:space="preserve">.</w:t>
+      </w:r>
+    </w:p>
+    <w:p>
+      <w:pPr>
+        <w:pStyle w:val="ListParagraph"/>
+        <w:numPr>
+          <w:ilvl w:val="0"/>
+          <w:numId w:val="3"/>
+        </w:numPr>
+        <w:bidi/>
+        <w:spacing w:after="80" w:line="300"/>
+        <w:jc w:val="right"/>
+      </w:pPr>
+      <w:r>
+        <w:rPr>
+          <w:rFonts w:ascii="Arial" w:cs="Arial" w:eastAsia="Arial" w:hAnsi="Arial"/>
+          <w:rtl/>
+        </w:rPr>
+        <w:t xml:space="preserve">المدير يملأ قسمه، والموظف يملأ قسمه ويوقّع — كل منهما على نسخته دون اطلاع على الأخرى.</w:t>
+      </w:r>
+    </w:p>
+    <w:p>
+      <w:pPr>
+        <w:pStyle w:val="ListParagraph"/>
+        <w:numPr>
+          <w:ilvl w:val="0"/>
+          <w:numId w:val="3"/>
+        </w:numPr>
+        <w:bidi/>
+        <w:spacing w:after="80" w:line="300"/>
+        <w:jc w:val="right"/>
+      </w:pPr>
+      <w:r>
+        <w:rPr>
+          <w:rFonts w:ascii="Arial" w:cs="Arial" w:eastAsia="Arial" w:hAnsi="Arial"/>
+          <w:rtl/>
+        </w:rPr>
+        <w:t xml:space="preserve">تُعقد جلسة المناقشة.</w:t>
+      </w:r>
+    </w:p>
+    <w:p>
+      <w:pPr>
+        <w:pStyle w:val="ListParagraph"/>
+        <w:numPr>
+          <w:ilvl w:val="0"/>
+          <w:numId w:val="3"/>
+        </w:numPr>
+        <w:bidi/>
+        <w:spacing w:after="80" w:line="300"/>
+        <w:jc w:val="right"/>
+      </w:pPr>
+      <w:r>
+        <w:rPr>
+          <w:rFonts w:ascii="Arial" w:cs="Arial" w:eastAsia="Arial" w:hAnsi="Arial"/>
+          <w:rtl/>
+        </w:rPr>
+        <w:t xml:space="preserve">الموارد البشرية تُدخل الرأيين في النظام وترفع صورة النموذج الموقّع.</w:t>
+      </w:r>
+    </w:p>
+    <w:p>
+      <w:pPr>
+        <w:pStyle w:val="Heading2"/>
+        <w:bidi/>
+        <w:spacing w:after="140" w:before="280"/>
+        <w:jc w:val="right"/>
+      </w:pPr>
+      <w:r>
+        <w:rPr>
+          <w:rFonts w:ascii="Arial" w:cs="Arial" w:eastAsia="Arial" w:hAnsi="Arial"/>
+          <w:rtl/>
+        </w:rPr>
+        <w:t xml:space="preserve">الربط بالسجل الانضباطي</w:t>
+      </w:r>
+    </w:p>
+    <w:p>
+      <w:pPr>
+        <w:bidi/>
+        <w:spacing w:after="120" w:line="300"/>
+        <w:jc w:val="right"/>
+      </w:pPr>
+      <w:r>
+        <w:rPr>
+          <w:rFonts w:ascii="Arial" w:cs="Arial" w:eastAsia="Arial" w:hAnsi="Arial"/>
+          <w:rtl/>
+        </w:rPr>
+        <w:t xml:space="preserve">عند فتح تقييم لموظف، يُرفق النظام تلقائياً </w:t>
+      </w:r>
+      <w:r>
+        <w:rPr>
+          <w:rFonts w:ascii="Arial" w:cs="Arial" w:eastAsia="Arial" w:hAnsi="Arial"/>
+          <w:b/>
+          <w:bCs/>
+          <w:rtl/>
+        </w:rPr>
+        <w:t xml:space="preserve">ملخص سجله خلال فترة التقييم</w:t>
+      </w:r>
+      <w:r>
+        <w:rPr>
+          <w:rFonts w:ascii="Arial" w:cs="Arial" w:eastAsia="Arial" w:hAnsi="Arial"/>
+          <w:rtl/>
+        </w:rPr>
+        <w:t xml:space="preserve">: عدد المخالفات وأنواعها ودرجاتها، إجمالي أيام الخصم، وأي تجميد سارٍ — فيُناقَش الأداء والانضباط معاً بدل أن يكونا ملفين منفصلين.</w:t>
+      </w:r>
+    </w:p>
+    <w:p>
+      <w:pPr>
+        <w:pBdr>
+          <w:right w:val="single" w:color="E0A030" w:sz="18" w:space="6"/>
+        </w:pBdr>
+        <w:shd w:fill="FFF4E0" w:color="auto" w:val="clear"/>
+        <w:bidi/>
+        <w:spacing w:after="200" w:before="120" w:line="300"/>
+        <w:ind w:start="300" w:end="300"/>
+        <w:jc w:val="right"/>
+      </w:pPr>
+      <w:r>
+        <w:rPr>
+          <w:rFonts w:ascii="Arial" w:cs="Arial" w:eastAsia="Arial" w:hAnsi="Arial"/>
+          <w:rtl/>
+        </w:rPr>
+        <w:t xml:space="preserve">جدير بالذكر أن الأنظمة المتخصصة تفصل الانضباط عن التقييم فصلاً تاماً؛ والربط بينهما هنا ممكن لأن النظام يملك الجانبين أصلاً.</w:t>
+      </w:r>
+    </w:p>
+    <w:p>
+      <w:pPr>
+        <w:pStyle w:val="Heading2"/>
+        <w:bidi/>
+        <w:spacing w:after="140" w:before="280"/>
+        <w:jc w:val="right"/>
+      </w:pPr>
+      <w:r>
+        <w:rPr>
+          <w:rFonts w:ascii="Arial" w:cs="Arial" w:eastAsia="Arial" w:hAnsi="Arial"/>
+          <w:rtl/>
+        </w:rPr>
+        <w:t xml:space="preserve">الربط بالترقيات</w:t>
+      </w:r>
+    </w:p>
+    <w:p>
+      <w:pPr>
+        <w:bidi/>
+        <w:spacing w:after="120" w:line="300"/>
+        <w:jc w:val="right"/>
+      </w:pPr>
+      <w:r>
+        <w:rPr>
+          <w:rFonts w:ascii="Arial" w:cs="Arial" w:eastAsia="Arial" w:hAnsi="Arial"/>
+          <w:rtl/>
+        </w:rPr>
+        <w:t xml:space="preserve">يكتمل به مقترح رقم ١٠: </w:t>
+      </w:r>
+      <w:r>
+        <w:rPr>
+          <w:rFonts w:ascii="Arial" w:cs="Arial" w:eastAsia="Arial" w:hAnsi="Arial"/>
+          <w:b/>
+          <w:bCs/>
+          <w:rtl/>
+        </w:rPr>
+        <w:t xml:space="preserve">الأهلية للترقية = لا تجميد سارٍ + تقدير آخر تقييم فوق حد تحدده الإدارة</w:t>
+      </w:r>
+      <w:r>
+        <w:rPr>
+          <w:rFonts w:ascii="Arial" w:cs="Arial" w:eastAsia="Arial" w:hAnsi="Arial"/>
+          <w:rtl/>
+        </w:rPr>
+        <w:t xml:space="preserve"> — فيصبح قرار الترقية مستنداً إلى بيانات لا إلى ذاكرة.</w:t>
+      </w:r>
+    </w:p>
+    <w:p>
+      <w:pPr>
+        <w:pStyle w:val="Heading2"/>
+        <w:bidi/>
+        <w:spacing w:after="140" w:before="280"/>
+        <w:jc w:val="right"/>
+      </w:pPr>
+      <w:r>
+        <w:rPr>
+          <w:rFonts w:ascii="Arial" w:cs="Arial" w:eastAsia="Arial" w:hAnsi="Arial"/>
+          <w:rtl/>
+        </w:rPr>
+        <w:t xml:space="preserve">الفائدة</w:t>
+      </w:r>
+    </w:p>
+    <w:p>
+      <w:pPr>
+        <w:pStyle w:val="ListParagraph"/>
+        <w:numPr>
+          <w:ilvl w:val="0"/>
+          <w:numId w:val="2"/>
+        </w:numPr>
+        <w:bidi/>
+        <w:spacing w:after="80" w:line="300"/>
+        <w:jc w:val="right"/>
+      </w:pPr>
+      <w:r>
+        <w:rPr>
+          <w:rFonts w:ascii="Arial" w:cs="Arial" w:eastAsia="Arial" w:hAnsi="Arial"/>
+          <w:rtl/>
+        </w:rPr>
+        <w:t xml:space="preserve">توثيق الأداء الإيجابي، لا السلبي وحده.</w:t>
+      </w:r>
+    </w:p>
+    <w:p>
+      <w:pPr>
+        <w:pStyle w:val="ListParagraph"/>
+        <w:numPr>
+          <w:ilvl w:val="0"/>
+          <w:numId w:val="2"/>
+        </w:numPr>
+        <w:bidi/>
+        <w:spacing w:after="80" w:line="300"/>
+        <w:jc w:val="right"/>
+      </w:pPr>
+      <w:r>
+        <w:rPr>
+          <w:rFonts w:ascii="Arial" w:cs="Arial" w:eastAsia="Arial" w:hAnsi="Arial"/>
+          <w:rtl/>
+        </w:rPr>
+        <w:t xml:space="preserve">أساس مكتوب لقرارات الترقية والمكافأة والتثبيت.</w:t>
+      </w:r>
+    </w:p>
+    <w:p>
+      <w:pPr>
+        <w:pStyle w:val="ListParagraph"/>
+        <w:numPr>
+          <w:ilvl w:val="0"/>
+          <w:numId w:val="2"/>
+        </w:numPr>
+        <w:bidi/>
+        <w:spacing w:after="80" w:line="300"/>
+        <w:jc w:val="right"/>
+      </w:pPr>
+      <w:r>
+        <w:rPr>
+          <w:rFonts w:ascii="Arial" w:cs="Arial" w:eastAsia="Arial" w:hAnsi="Arial"/>
+          <w:rtl/>
+        </w:rPr>
+        <w:t xml:space="preserve">جلسة سنوية منظمة بين المدير وموظفه، بمحضر محفوظ.</w:t>
+      </w:r>
+    </w:p>
+    <w:p>
+      <w:pPr>
+        <w:pStyle w:val="ListParagraph"/>
+        <w:numPr>
+          <w:ilvl w:val="0"/>
+          <w:numId w:val="2"/>
+        </w:numPr>
+        <w:bidi/>
+        <w:spacing w:after="80" w:line="300"/>
+        <w:jc w:val="right"/>
+      </w:pPr>
+      <w:r>
+        <w:rPr>
+          <w:rFonts w:ascii="Arial" w:cs="Arial" w:eastAsia="Arial" w:hAnsi="Arial"/>
+          <w:rtl/>
+        </w:rPr>
+        <w:t xml:space="preserve">تراكم تاريخي: مقارنة تقييمات الموظف عبر السنوات في ملفه.</w:t>
+      </w:r>
+    </w:p>
+    <w:p>
+      <w:pPr>
+        <w:pStyle w:val="Heading2"/>
+        <w:bidi/>
+        <w:spacing w:after="140" w:before="280"/>
+        <w:jc w:val="right"/>
+      </w:pPr>
+      <w:r>
+        <w:rPr>
+          <w:rFonts w:ascii="Arial" w:cs="Arial" w:eastAsia="Arial" w:hAnsi="Arial"/>
+          <w:rtl/>
+        </w:rPr>
+        <w:t xml:space="preserve">تحفّظ يجب أخذه في الاعتبار قبل الاعتماد</w:t>
+      </w:r>
+    </w:p>
+    <w:p>
+      <w:pPr>
+        <w:bidi/>
+        <w:spacing w:after="120" w:line="300"/>
+        <w:jc w:val="right"/>
+      </w:pPr>
+      <w:r>
+        <w:rPr>
+          <w:rFonts w:ascii="Arial" w:cs="Arial" w:eastAsia="Arial" w:hAnsi="Arial"/>
+          <w:rtl/>
+        </w:rPr>
+        <w:t xml:space="preserve">التقييم الدوري </w:t>
+      </w:r>
+      <w:r>
+        <w:rPr>
+          <w:rFonts w:ascii="Arial" w:cs="Arial" w:eastAsia="Arial" w:hAnsi="Arial"/>
+          <w:b/>
+          <w:bCs/>
+          <w:rtl/>
+        </w:rPr>
+        <w:t xml:space="preserve">التزام تنظيمي أكثر منه أداة برمجية</w:t>
+      </w:r>
+      <w:r>
+        <w:rPr>
+          <w:rFonts w:ascii="Arial" w:cs="Arial" w:eastAsia="Arial" w:hAnsi="Arial"/>
+          <w:rtl/>
+        </w:rPr>
+        <w:t xml:space="preserve">. نجاحه يتوقف على انضباط الإدارة في إجرائه في موعده وبجدية، لا على وجوده في النظام. وإن لم يكن هناك التزام حقيقي بذلك، فالأفضل تأجيله والاكتفاء بالسجل الانضباطي — تقييم شكلي يُملأ على عجل مرة في السنة يضرّ أكثر مما ينفع، لأنه يمنح قرارات لاحقة غطاءً لا تستحقه.</w:t>
+      </w:r>
+    </w:p>
+    <w:p>
+      <w:pPr>
+        <w:bidi/>
+        <w:spacing w:after="120" w:line="300"/>
+        <w:jc w:val="right"/>
+      </w:pPr>
+      <w:r>
+        <w:rPr>
+          <w:rFonts w:ascii="Arial" w:cs="Arial" w:eastAsia="Arial" w:hAnsi="Arial"/>
+          <w:rtl/>
+        </w:rPr>
+        <w:t xml:space="preserve">كما يُقترح البدء بالنسخة المبسّطة الموصوفة أعلاه، وتأجيل الأساليب الأعقد (الأهداف الرقمية والأوزان النسبية وتقييم الزملاء والمرؤوسين) حتى تستقر الدورة السنوية أولاً.</w:t>
+      </w:r>
+    </w:p>
     <w:sectPr>
       <w:footerReference w:type="default" r:id="rId7"/>
       <w:pgSz w:w="11906" w:h="16838" w:orient="portrait"/>

</xml_diff>